<commit_message>
updated stuff in the gdd
also creating a fable to act as our guide through this game.
</commit_message>
<xml_diff>
--- a/Planning And Documentation/Game Design Document.docx
+++ b/Planning And Documentation/Game Design Document.docx
@@ -66,118 +66,8 @@
           <w:sz w:val="40"/>
           <w:szCs w:val="40"/>
         </w:rPr>
-        <w:t>Game Overview:</w:t>
-      </w:r>
-    </w:p>
-    <w:p>
-      <w:pPr>
-        <w:pStyle w:val="ListParagraph"/>
-        <w:numPr>
-          <w:ilvl w:val="0"/>
-          <w:numId w:val="1"/>
-        </w:numPr>
-        <w:rPr>
-          <w:sz w:val="32"/>
-          <w:szCs w:val="32"/>
-        </w:rPr>
-      </w:pPr>
-      <w:r>
-        <w:rPr>
-          <w:sz w:val="32"/>
-          <w:szCs w:val="32"/>
-        </w:rPr>
-        <w:t xml:space="preserve">Genre: </w:t>
-      </w:r>
-    </w:p>
-    <w:p>
-      <w:pPr>
-        <w:pStyle w:val="ListParagraph"/>
-        <w:numPr>
-          <w:ilvl w:val="0"/>
-          <w:numId w:val="1"/>
-        </w:numPr>
-        <w:rPr>
-          <w:sz w:val="32"/>
-          <w:szCs w:val="32"/>
-        </w:rPr>
-      </w:pPr>
-      <w:r>
-        <w:rPr>
-          <w:sz w:val="32"/>
-          <w:szCs w:val="32"/>
-        </w:rPr>
-        <w:t xml:space="preserve">Sub-Genre: </w:t>
-      </w:r>
-    </w:p>
-    <w:p>
-      <w:pPr>
-        <w:pStyle w:val="ListParagraph"/>
-        <w:numPr>
-          <w:ilvl w:val="0"/>
-          <w:numId w:val="1"/>
-        </w:numPr>
-        <w:rPr>
-          <w:sz w:val="32"/>
-          <w:szCs w:val="32"/>
-        </w:rPr>
-      </w:pPr>
-      <w:r>
-        <w:rPr>
-          <w:sz w:val="32"/>
-          <w:szCs w:val="32"/>
-        </w:rPr>
-        <w:t>Platform:</w:t>
-      </w:r>
-      <w:r>
-        <w:rPr>
-          <w:sz w:val="32"/>
-          <w:szCs w:val="32"/>
-        </w:rPr>
-        <w:t xml:space="preserve"> </w:t>
-      </w:r>
-      <w:r>
-        <w:rPr>
-          <w:sz w:val="32"/>
-          <w:szCs w:val="32"/>
-        </w:rPr>
-        <w:t>Web browser</w:t>
-      </w:r>
-    </w:p>
-    <w:p>
-      <w:pPr>
-        <w:pStyle w:val="ListParagraph"/>
-        <w:numPr>
-          <w:ilvl w:val="0"/>
-          <w:numId w:val="1"/>
-        </w:numPr>
-        <w:rPr>
-          <w:sz w:val="32"/>
-          <w:szCs w:val="32"/>
-        </w:rPr>
-      </w:pPr>
-      <w:r>
-        <w:rPr>
-          <w:sz w:val="32"/>
-          <w:szCs w:val="32"/>
-        </w:rPr>
-        <w:t>Target Audience:</w:t>
-      </w:r>
-      <w:r>
-        <w:rPr>
-          <w:sz w:val="32"/>
-          <w:szCs w:val="32"/>
-        </w:rPr>
-        <w:t xml:space="preserve"> </w:t>
-      </w:r>
-    </w:p>
-    <w:p>
-      <w:pPr>
-        <w:rPr>
-          <w:rStyle w:val="SubtitleChar"/>
-          <w:sz w:val="32"/>
-          <w:szCs w:val="32"/>
-        </w:rPr>
-      </w:pPr>
+        <w:t>Game Jam Theme:</w:t>
+      </w:r>
     </w:p>
     <w:p>
       <w:pPr>
@@ -193,27 +83,7 @@
           <w:sz w:val="40"/>
           <w:szCs w:val="40"/>
         </w:rPr>
-        <w:t>Pillars:</w:t>
-      </w:r>
-    </w:p>
-    <w:p>
-      <w:pPr>
-        <w:pStyle w:val="ListParagraph"/>
-        <w:numPr>
-          <w:ilvl w:val="0"/>
-          <w:numId w:val="1"/>
-        </w:numPr>
-        <w:rPr>
-          <w:sz w:val="32"/>
-          <w:szCs w:val="32"/>
-        </w:rPr>
-      </w:pPr>
-      <w:r>
-        <w:rPr>
-          <w:sz w:val="32"/>
-          <w:szCs w:val="32"/>
-        </w:rPr>
-        <w:t>Pillar 1</w:t>
+        <w:t>“Timeless”</w:t>
       </w:r>
     </w:p>
     <w:p>
@@ -230,259 +100,573 @@
           <w:sz w:val="40"/>
           <w:szCs w:val="40"/>
         </w:rPr>
-        <w:t>Gameplay</w:t>
-      </w:r>
-      <w:r>
+        <w:t>Working Title: “The Girl and the Snake”</w:t>
+      </w:r>
+    </w:p>
+    <w:p>
+      <w:pPr>
         <w:rPr>
           <w:rStyle w:val="SubtitleChar"/>
           <w:sz w:val="40"/>
           <w:szCs w:val="40"/>
         </w:rPr>
-        <w:t>:</w:t>
-      </w:r>
-    </w:p>
-    <w:p>
-      <w:pPr>
-        <w:pStyle w:val="ListParagraph"/>
-        <w:numPr>
-          <w:ilvl w:val="0"/>
-          <w:numId w:val="1"/>
-        </w:numPr>
-        <w:rPr>
-          <w:sz w:val="32"/>
-          <w:szCs w:val="32"/>
-        </w:rPr>
-      </w:pPr>
-      <w:r>
-        <w:rPr>
-          <w:sz w:val="32"/>
-          <w:szCs w:val="32"/>
-        </w:rPr>
-        <w:t>Core Loop:</w:t>
-      </w:r>
-    </w:p>
-    <w:p>
-      <w:pPr>
-        <w:pStyle w:val="ListParagraph"/>
-        <w:numPr>
-          <w:ilvl w:val="1"/>
-          <w:numId w:val="1"/>
-        </w:numPr>
-        <w:rPr>
-          <w:sz w:val="32"/>
-          <w:szCs w:val="32"/>
-        </w:rPr>
-      </w:pPr>
-      <w:r>
-        <w:rPr>
-          <w:sz w:val="28"/>
-          <w:szCs w:val="28"/>
-        </w:rPr>
-        <w:t>Do thing</w:t>
-      </w:r>
-      <w:r>
-        <w:rPr>
-          <w:sz w:val="28"/>
-          <w:szCs w:val="28"/>
-        </w:rPr>
-        <w:t xml:space="preserve"> </w:t>
-      </w:r>
-      <w:r>
-        <w:rPr>
-          <w:sz w:val="28"/>
-          <w:szCs w:val="28"/>
-        </w:rPr>
-        <w:sym w:font="Wingdings" w:char="F0E0"/>
-      </w:r>
-      <w:r>
-        <w:rPr>
-          <w:sz w:val="28"/>
-          <w:szCs w:val="28"/>
-        </w:rPr>
-        <w:t xml:space="preserve"> </w:t>
-      </w:r>
-      <w:r>
-        <w:rPr>
-          <w:sz w:val="28"/>
-          <w:szCs w:val="28"/>
-        </w:rPr>
-        <w:t>Do more thing</w:t>
-      </w:r>
-      <w:r>
-        <w:rPr>
-          <w:sz w:val="28"/>
-          <w:szCs w:val="28"/>
-        </w:rPr>
-        <w:t xml:space="preserve"> </w:t>
-      </w:r>
-      <w:r>
-        <w:rPr>
-          <w:sz w:val="28"/>
-          <w:szCs w:val="28"/>
-        </w:rPr>
-        <w:sym w:font="Wingdings" w:char="F0E0"/>
-      </w:r>
-      <w:r>
-        <w:rPr>
-          <w:sz w:val="28"/>
-          <w:szCs w:val="28"/>
-        </w:rPr>
-        <w:t xml:space="preserve"> </w:t>
-      </w:r>
-    </w:p>
-    <w:p>
-      <w:pPr>
+      </w:pPr>
+      <w:r>
         <w:rPr>
           <w:rStyle w:val="SubtitleChar"/>
           <w:sz w:val="40"/>
           <w:szCs w:val="40"/>
         </w:rPr>
-      </w:pPr>
-      <w:r>
+        <w:t>Game Overview:</w:t>
+      </w:r>
+    </w:p>
+    <w:p>
+      <w:pPr>
+        <w:pStyle w:val="ListParagraph"/>
+        <w:numPr>
+          <w:ilvl w:val="0"/>
+          <w:numId w:val="1"/>
+        </w:numPr>
+        <w:rPr>
+          <w:sz w:val="32"/>
+          <w:szCs w:val="32"/>
+        </w:rPr>
+      </w:pPr>
+      <w:r>
+        <w:rPr>
+          <w:sz w:val="32"/>
+          <w:szCs w:val="32"/>
+        </w:rPr>
+        <w:t>Genre</w:t>
+      </w:r>
+      <w:r>
+        <w:rPr>
+          <w:sz w:val="32"/>
+          <w:szCs w:val="32"/>
+        </w:rPr>
+        <w:t>s</w:t>
+      </w:r>
+      <w:r>
+        <w:rPr>
+          <w:sz w:val="32"/>
+          <w:szCs w:val="32"/>
+        </w:rPr>
+        <w:t xml:space="preserve">: </w:t>
+      </w:r>
+      <w:r>
+        <w:rPr>
+          <w:sz w:val="32"/>
+          <w:szCs w:val="32"/>
+        </w:rPr>
+        <w:t xml:space="preserve">2D </w:t>
+      </w:r>
+      <w:proofErr w:type="spellStart"/>
+      <w:r>
+        <w:rPr>
+          <w:sz w:val="32"/>
+          <w:szCs w:val="32"/>
+        </w:rPr>
+        <w:t>Sidescroller</w:t>
+      </w:r>
+      <w:proofErr w:type="spellEnd"/>
+    </w:p>
+    <w:p>
+      <w:pPr>
+        <w:pStyle w:val="ListParagraph"/>
+        <w:numPr>
+          <w:ilvl w:val="0"/>
+          <w:numId w:val="1"/>
+        </w:numPr>
+        <w:rPr>
+          <w:sz w:val="32"/>
+          <w:szCs w:val="32"/>
+        </w:rPr>
+      </w:pPr>
+      <w:r>
+        <w:rPr>
+          <w:sz w:val="32"/>
+          <w:szCs w:val="32"/>
+        </w:rPr>
+        <w:t xml:space="preserve">Sub-Genre: </w:t>
+      </w:r>
+      <w:r>
+        <w:rPr>
+          <w:sz w:val="32"/>
+          <w:szCs w:val="32"/>
+        </w:rPr>
+        <w:t xml:space="preserve">Narrative Driven, action, horror, </w:t>
+      </w:r>
+    </w:p>
+    <w:p>
+      <w:pPr>
+        <w:pStyle w:val="ListParagraph"/>
+        <w:numPr>
+          <w:ilvl w:val="0"/>
+          <w:numId w:val="1"/>
+        </w:numPr>
+        <w:rPr>
+          <w:sz w:val="32"/>
+          <w:szCs w:val="32"/>
+        </w:rPr>
+      </w:pPr>
+      <w:r>
+        <w:rPr>
+          <w:sz w:val="32"/>
+          <w:szCs w:val="32"/>
+        </w:rPr>
+        <w:t>Platform:</w:t>
+      </w:r>
+      <w:r>
+        <w:rPr>
+          <w:sz w:val="32"/>
+          <w:szCs w:val="32"/>
+        </w:rPr>
+        <w:t xml:space="preserve"> Web browser</w:t>
+      </w:r>
+    </w:p>
+    <w:p>
+      <w:pPr>
+        <w:pStyle w:val="ListParagraph"/>
+        <w:numPr>
+          <w:ilvl w:val="0"/>
+          <w:numId w:val="1"/>
+        </w:numPr>
+        <w:rPr>
+          <w:sz w:val="32"/>
+          <w:szCs w:val="32"/>
+        </w:rPr>
+      </w:pPr>
+      <w:r>
+        <w:rPr>
+          <w:sz w:val="32"/>
+          <w:szCs w:val="32"/>
+        </w:rPr>
+        <w:t>Target Audience:</w:t>
+      </w:r>
+      <w:r>
+        <w:rPr>
+          <w:sz w:val="32"/>
+          <w:szCs w:val="32"/>
+        </w:rPr>
+        <w:t xml:space="preserve"> </w:t>
+      </w:r>
+      <w:r>
+        <w:rPr>
+          <w:sz w:val="32"/>
+          <w:szCs w:val="32"/>
+        </w:rPr>
+        <w:t>adults, psychological horror &amp; horror enjoyers, casual gamers, narrative gamers</w:t>
+      </w:r>
+      <w:r>
+        <w:rPr>
+          <w:sz w:val="32"/>
+          <w:szCs w:val="32"/>
+        </w:rPr>
+        <w:t>, (explorers)</w:t>
+      </w:r>
+    </w:p>
+    <w:p>
+      <w:pPr>
+        <w:rPr>
+          <w:rStyle w:val="SubtitleChar"/>
+          <w:sz w:val="32"/>
+          <w:szCs w:val="32"/>
+        </w:rPr>
+      </w:pPr>
+    </w:p>
+    <w:p>
+      <w:pPr>
         <w:rPr>
           <w:rStyle w:val="SubtitleChar"/>
           <w:sz w:val="40"/>
           <w:szCs w:val="40"/>
         </w:rPr>
-        <w:t>Mechanics:</w:t>
-      </w:r>
-    </w:p>
-    <w:p>
-      <w:pPr>
-        <w:pStyle w:val="ListParagraph"/>
-        <w:numPr>
-          <w:ilvl w:val="0"/>
-          <w:numId w:val="1"/>
-        </w:numPr>
-        <w:rPr>
-          <w:sz w:val="32"/>
-          <w:szCs w:val="32"/>
-        </w:rPr>
-      </w:pPr>
-      <w:r>
-        <w:rPr>
-          <w:sz w:val="32"/>
-          <w:szCs w:val="32"/>
-        </w:rPr>
-        <w:t>Mechanic 1</w:t>
-      </w:r>
-      <w:r>
-        <w:rPr>
-          <w:sz w:val="32"/>
-          <w:szCs w:val="32"/>
-        </w:rPr>
-        <w:t>:</w:t>
-      </w:r>
-    </w:p>
-    <w:p>
-      <w:pPr>
-        <w:pStyle w:val="ListParagraph"/>
-        <w:numPr>
-          <w:ilvl w:val="1"/>
-          <w:numId w:val="1"/>
-        </w:numPr>
-        <w:rPr>
-          <w:sz w:val="32"/>
-          <w:szCs w:val="32"/>
-        </w:rPr>
-      </w:pPr>
-      <w:r>
-        <w:rPr>
-          <w:sz w:val="28"/>
-          <w:szCs w:val="28"/>
-        </w:rPr>
-        <w:t>Mechanic details 1.</w:t>
-      </w:r>
-    </w:p>
-    <w:p>
-      <w:pPr>
+      </w:pPr>
+      <w:r>
         <w:rPr>
           <w:rStyle w:val="SubtitleChar"/>
           <w:sz w:val="40"/>
           <w:szCs w:val="40"/>
         </w:rPr>
-      </w:pPr>
-      <w:r>
+        <w:t>Pillars:</w:t>
+      </w:r>
+    </w:p>
+    <w:p>
+      <w:pPr>
+        <w:pStyle w:val="ListParagraph"/>
+        <w:numPr>
+          <w:ilvl w:val="0"/>
+          <w:numId w:val="1"/>
+        </w:numPr>
+        <w:rPr>
+          <w:sz w:val="32"/>
+          <w:szCs w:val="32"/>
+        </w:rPr>
+      </w:pPr>
+      <w:r>
+        <w:rPr>
+          <w:sz w:val="32"/>
+          <w:szCs w:val="32"/>
+        </w:rPr>
+        <w:t>Pillar 1</w:t>
+      </w:r>
+      <w:r>
+        <w:rPr>
+          <w:sz w:val="32"/>
+          <w:szCs w:val="32"/>
+        </w:rPr>
+        <w:t xml:space="preserve">: Moving – the idea that time is always moving, whether it’s like </w:t>
+      </w:r>
+      <w:r>
+        <w:rPr>
+          <w:i/>
+          <w:iCs/>
+          <w:sz w:val="32"/>
+          <w:szCs w:val="32"/>
+        </w:rPr>
+        <w:t>Doctor Who</w:t>
+      </w:r>
+      <w:r>
+        <w:rPr>
+          <w:sz w:val="32"/>
+          <w:szCs w:val="32"/>
+        </w:rPr>
+        <w:t xml:space="preserve"> logic (wibbly-wobbly time-y-</w:t>
+      </w:r>
+      <w:proofErr w:type="spellStart"/>
+      <w:r>
+        <w:rPr>
+          <w:sz w:val="32"/>
+          <w:szCs w:val="32"/>
+        </w:rPr>
+        <w:t>wime</w:t>
+      </w:r>
+      <w:proofErr w:type="spellEnd"/>
+      <w:r>
+        <w:rPr>
+          <w:sz w:val="32"/>
+          <w:szCs w:val="32"/>
+        </w:rPr>
+        <w:t>-y), linear, or cyclical (ouroboros – snake that eats its own tail)</w:t>
+      </w:r>
+    </w:p>
+    <w:p>
+      <w:pPr>
+        <w:pStyle w:val="ListParagraph"/>
+        <w:numPr>
+          <w:ilvl w:val="0"/>
+          <w:numId w:val="1"/>
+        </w:numPr>
+        <w:rPr>
+          <w:sz w:val="32"/>
+          <w:szCs w:val="32"/>
+        </w:rPr>
+      </w:pPr>
+      <w:r>
+        <w:rPr>
+          <w:sz w:val="32"/>
+          <w:szCs w:val="32"/>
+        </w:rPr>
+        <w:t xml:space="preserve">Pillar 2: Relativity – the idea that time itself is relative, that it doesn’t pass the same way for two people. Can be represented like time slowing to a crawl versus </w:t>
+      </w:r>
+      <w:r>
+        <w:rPr>
+          <w:sz w:val="32"/>
+          <w:szCs w:val="32"/>
+        </w:rPr>
+        <w:t>everything happening all at once.</w:t>
+      </w:r>
+    </w:p>
+    <w:p>
+      <w:pPr>
+        <w:pStyle w:val="ListParagraph"/>
+        <w:numPr>
+          <w:ilvl w:val="0"/>
+          <w:numId w:val="1"/>
+        </w:numPr>
+        <w:rPr>
+          <w:sz w:val="32"/>
+          <w:szCs w:val="32"/>
+        </w:rPr>
+      </w:pPr>
+      <w:r>
+        <w:rPr>
+          <w:sz w:val="32"/>
+          <w:szCs w:val="32"/>
+        </w:rPr>
+        <w:t>Pillar 3:</w:t>
+      </w:r>
+      <w:r>
+        <w:rPr>
+          <w:sz w:val="32"/>
+          <w:szCs w:val="32"/>
+        </w:rPr>
+        <w:t xml:space="preserve"> Change – with time comes change. A change in state, a change in place, a change in being. </w:t>
+      </w:r>
+    </w:p>
+    <w:p>
+      <w:pPr>
         <w:rPr>
           <w:rStyle w:val="SubtitleChar"/>
           <w:sz w:val="40"/>
           <w:szCs w:val="40"/>
         </w:rPr>
-        <w:t>Art and Sound</w:t>
-      </w:r>
+      </w:pPr>
       <w:r>
         <w:rPr>
           <w:rStyle w:val="SubtitleChar"/>
           <w:sz w:val="40"/>
           <w:szCs w:val="40"/>
         </w:rPr>
-        <w:t>:</w:t>
-      </w:r>
-    </w:p>
-    <w:p>
-      <w:pPr>
-        <w:pStyle w:val="ListParagraph"/>
-        <w:numPr>
-          <w:ilvl w:val="0"/>
-          <w:numId w:val="1"/>
-        </w:numPr>
-        <w:rPr>
-          <w:sz w:val="32"/>
-          <w:szCs w:val="32"/>
-        </w:rPr>
-      </w:pPr>
-      <w:r>
-        <w:rPr>
-          <w:sz w:val="32"/>
-          <w:szCs w:val="32"/>
-        </w:rPr>
-        <w:t>Art-Style:</w:t>
-      </w:r>
-    </w:p>
-    <w:p>
-      <w:pPr>
-        <w:pStyle w:val="ListParagraph"/>
-        <w:numPr>
-          <w:ilvl w:val="1"/>
-          <w:numId w:val="1"/>
-        </w:numPr>
-        <w:rPr>
-          <w:sz w:val="32"/>
-          <w:szCs w:val="32"/>
-        </w:rPr>
-      </w:pPr>
-      <w:r>
-        <w:rPr>
-          <w:sz w:val="28"/>
-          <w:szCs w:val="28"/>
-        </w:rPr>
-        <w:t>Art details</w:t>
-      </w:r>
-    </w:p>
-    <w:p>
-      <w:pPr>
+        <w:t>Gameplay</w:t>
+      </w:r>
+      <w:r>
         <w:rPr>
           <w:rStyle w:val="SubtitleChar"/>
           <w:sz w:val="40"/>
           <w:szCs w:val="40"/>
         </w:rPr>
-      </w:pPr>
-      <w:r>
+        <w:t>:</w:t>
+      </w:r>
+    </w:p>
+    <w:p>
+      <w:pPr>
+        <w:pStyle w:val="ListParagraph"/>
+        <w:numPr>
+          <w:ilvl w:val="0"/>
+          <w:numId w:val="1"/>
+        </w:numPr>
+        <w:rPr>
+          <w:sz w:val="32"/>
+          <w:szCs w:val="32"/>
+        </w:rPr>
+      </w:pPr>
+      <w:r>
+        <w:rPr>
+          <w:sz w:val="32"/>
+          <w:szCs w:val="32"/>
+        </w:rPr>
+        <w:lastRenderedPageBreak/>
+        <w:t>Core Loop:</w:t>
+      </w:r>
+      <w:r>
+        <w:rPr>
+          <w:sz w:val="32"/>
+          <w:szCs w:val="32"/>
+        </w:rPr>
+        <w:t xml:space="preserve"> 2D side scrolling, with limited verticality, and a simple combat system. </w:t>
+      </w:r>
+    </w:p>
+    <w:p>
+      <w:pPr>
+        <w:pStyle w:val="ListParagraph"/>
+        <w:numPr>
+          <w:ilvl w:val="1"/>
+          <w:numId w:val="1"/>
+        </w:numPr>
+        <w:rPr>
+          <w:sz w:val="32"/>
+          <w:szCs w:val="32"/>
+        </w:rPr>
+      </w:pPr>
+      <w:r>
+        <w:rPr>
+          <w:sz w:val="28"/>
+          <w:szCs w:val="28"/>
+        </w:rPr>
+        <w:t>Player walks forward</w:t>
+      </w:r>
+      <w:r>
+        <w:rPr>
+          <w:sz w:val="28"/>
+          <w:szCs w:val="28"/>
+        </w:rPr>
+        <w:t xml:space="preserve"> </w:t>
+      </w:r>
+      <w:r>
+        <w:rPr>
+          <w:sz w:val="28"/>
+          <w:szCs w:val="28"/>
+        </w:rPr>
+        <w:sym w:font="Wingdings" w:char="F0E0"/>
+      </w:r>
+      <w:r>
+        <w:rPr>
+          <w:sz w:val="28"/>
+          <w:szCs w:val="28"/>
+        </w:rPr>
+        <w:t xml:space="preserve"> </w:t>
+      </w:r>
+      <w:r>
+        <w:rPr>
+          <w:sz w:val="28"/>
+          <w:szCs w:val="28"/>
+        </w:rPr>
+        <w:t>Player fights/hides from monsters</w:t>
+      </w:r>
+      <w:r>
+        <w:rPr>
+          <w:sz w:val="28"/>
+          <w:szCs w:val="28"/>
+        </w:rPr>
+        <w:t xml:space="preserve"> </w:t>
+      </w:r>
+      <w:r>
+        <w:rPr>
+          <w:sz w:val="28"/>
+          <w:szCs w:val="28"/>
+        </w:rPr>
+        <w:sym w:font="Wingdings" w:char="F0E0"/>
+      </w:r>
+      <w:r>
+        <w:rPr>
+          <w:sz w:val="28"/>
+          <w:szCs w:val="28"/>
+        </w:rPr>
+        <w:t xml:space="preserve"> </w:t>
+      </w:r>
+      <w:r>
+        <w:rPr>
+          <w:sz w:val="28"/>
+          <w:szCs w:val="28"/>
+        </w:rPr>
+        <w:t>repeat</w:t>
+      </w:r>
+    </w:p>
+    <w:p>
+      <w:pPr>
         <w:rPr>
           <w:rStyle w:val="SubtitleChar"/>
           <w:sz w:val="40"/>
           <w:szCs w:val="40"/>
         </w:rPr>
-        <w:t>UI</w:t>
-      </w:r>
+      </w:pPr>
       <w:r>
         <w:rPr>
           <w:rStyle w:val="SubtitleChar"/>
           <w:sz w:val="40"/>
           <w:szCs w:val="40"/>
         </w:rPr>
+        <w:t>Mechanics:</w:t>
+      </w:r>
+    </w:p>
+    <w:p>
+      <w:pPr>
+        <w:pStyle w:val="ListParagraph"/>
+        <w:numPr>
+          <w:ilvl w:val="0"/>
+          <w:numId w:val="1"/>
+        </w:numPr>
+        <w:rPr>
+          <w:sz w:val="32"/>
+          <w:szCs w:val="32"/>
+        </w:rPr>
+      </w:pPr>
+      <w:r>
+        <w:rPr>
+          <w:sz w:val="32"/>
+          <w:szCs w:val="32"/>
+        </w:rPr>
+        <w:t>Mechanic 1:</w:t>
+      </w:r>
+    </w:p>
+    <w:p>
+      <w:pPr>
+        <w:pStyle w:val="ListParagraph"/>
+        <w:numPr>
+          <w:ilvl w:val="1"/>
+          <w:numId w:val="1"/>
+        </w:numPr>
+        <w:rPr>
+          <w:sz w:val="32"/>
+          <w:szCs w:val="32"/>
+        </w:rPr>
+      </w:pPr>
+      <w:r>
+        <w:rPr>
+          <w:sz w:val="28"/>
+          <w:szCs w:val="28"/>
+        </w:rPr>
+        <w:t xml:space="preserve">Player moves </w:t>
+      </w:r>
+      <w:proofErr w:type="gramStart"/>
+      <w:r>
+        <w:rPr>
+          <w:sz w:val="28"/>
+          <w:szCs w:val="28"/>
+        </w:rPr>
+        <w:t>forward,</w:t>
+      </w:r>
+      <w:proofErr w:type="gramEnd"/>
+      <w:r>
+        <w:rPr>
+          <w:sz w:val="28"/>
+          <w:szCs w:val="28"/>
+        </w:rPr>
+        <w:t xml:space="preserve"> player moves back. (</w:t>
+      </w:r>
+      <w:proofErr w:type="gramStart"/>
+      <w:r>
+        <w:rPr>
+          <w:sz w:val="28"/>
+          <w:szCs w:val="28"/>
+        </w:rPr>
+        <w:t>stretch</w:t>
+      </w:r>
+      <w:proofErr w:type="gramEnd"/>
+      <w:r>
+        <w:rPr>
+          <w:sz w:val="28"/>
+          <w:szCs w:val="28"/>
+        </w:rPr>
+        <w:t xml:space="preserve"> goal</w:t>
+      </w:r>
+      <w:r>
+        <w:rPr>
+          <w:sz w:val="28"/>
+          <w:szCs w:val="28"/>
+        </w:rPr>
         <w:t>:</w:t>
       </w:r>
+      <w:r>
+        <w:rPr>
+          <w:sz w:val="28"/>
+          <w:szCs w:val="28"/>
+        </w:rPr>
+        <w:t xml:space="preserve"> player moves </w:t>
+      </w:r>
+      <w:r>
+        <w:rPr>
+          <w:i/>
+          <w:iCs/>
+          <w:sz w:val="28"/>
+          <w:szCs w:val="28"/>
+        </w:rPr>
+        <w:t>deeper</w:t>
+      </w:r>
+      <w:r>
+        <w:rPr>
+          <w:sz w:val="28"/>
+          <w:szCs w:val="28"/>
+        </w:rPr>
+        <w:t xml:space="preserve"> into the game, or </w:t>
+      </w:r>
+      <w:r>
+        <w:rPr>
+          <w:i/>
+          <w:iCs/>
+          <w:sz w:val="28"/>
+          <w:szCs w:val="28"/>
+        </w:rPr>
+        <w:t xml:space="preserve">towards </w:t>
+      </w:r>
+      <w:r>
+        <w:rPr>
+          <w:sz w:val="28"/>
+          <w:szCs w:val="28"/>
+        </w:rPr>
+        <w:t>the player.</w:t>
+      </w:r>
     </w:p>
     <w:p>
       <w:pPr>
@@ -498,10 +682,10 @@
       </w:pPr>
       <w:r>
         <w:rPr>
-          <w:sz w:val="32"/>
-          <w:szCs w:val="32"/>
-        </w:rPr>
-        <w:t>Main Menu:</w:t>
+          <w:sz w:val="28"/>
+          <w:szCs w:val="28"/>
+        </w:rPr>
+        <w:t>Mechanic 2:</w:t>
       </w:r>
     </w:p>
     <w:p>
@@ -521,14 +705,70 @@
           <w:sz w:val="28"/>
           <w:szCs w:val="28"/>
         </w:rPr>
-        <w:t>Main menu</w:t>
-      </w:r>
-      <w:r>
-        <w:rPr>
-          <w:sz w:val="28"/>
-          <w:szCs w:val="28"/>
-        </w:rPr>
-        <w:t xml:space="preserve"> details</w:t>
+        <w:t xml:space="preserve">Player swings a sword/club to fight. (Horror elements involve some method of disempowerment, meaning that </w:t>
+      </w:r>
+      <w:r>
+        <w:rPr>
+          <w:sz w:val="28"/>
+          <w:szCs w:val="28"/>
+        </w:rPr>
+        <w:t>the player feels weak and scared. Used for “open combat, and stealth encounters (sneaking up on someone)</w:t>
+      </w:r>
+    </w:p>
+    <w:p>
+      <w:pPr>
+        <w:pStyle w:val="ListParagraph"/>
+        <w:numPr>
+          <w:ilvl w:val="0"/>
+          <w:numId w:val="1"/>
+        </w:numPr>
+        <w:rPr>
+          <w:sz w:val="32"/>
+          <w:szCs w:val="32"/>
+        </w:rPr>
+      </w:pPr>
+      <w:r>
+        <w:rPr>
+          <w:sz w:val="28"/>
+          <w:szCs w:val="28"/>
+        </w:rPr>
+        <w:t xml:space="preserve">Mechanic 3: </w:t>
+      </w:r>
+    </w:p>
+    <w:p>
+      <w:pPr>
+        <w:pStyle w:val="ListParagraph"/>
+        <w:numPr>
+          <w:ilvl w:val="1"/>
+          <w:numId w:val="1"/>
+        </w:numPr>
+        <w:rPr>
+          <w:sz w:val="32"/>
+          <w:szCs w:val="32"/>
+        </w:rPr>
+      </w:pPr>
+      <w:r>
+        <w:rPr>
+          <w:sz w:val="28"/>
+          <w:szCs w:val="28"/>
+        </w:rPr>
+        <w:t xml:space="preserve">Sneaking? With horror, the idea of running and hiding is a valid option, so maybe? A lot of </w:t>
+      </w:r>
+      <w:proofErr w:type="spellStart"/>
+      <w:r>
+        <w:rPr>
+          <w:sz w:val="28"/>
+          <w:szCs w:val="28"/>
+        </w:rPr>
+        <w:t>sidescrollers</w:t>
+      </w:r>
+      <w:proofErr w:type="spellEnd"/>
+      <w:r>
+        <w:rPr>
+          <w:sz w:val="28"/>
+          <w:szCs w:val="28"/>
+        </w:rPr>
+        <w:t xml:space="preserve"> have that functionality, with hiding inside closets, or even under things, so it is possible, and worth considering. If time is an issue, then we can just do melee. </w:t>
       </w:r>
     </w:p>
     <w:p>
@@ -545,8 +785,7 @@
           <w:sz w:val="40"/>
           <w:szCs w:val="40"/>
         </w:rPr>
-        <w:lastRenderedPageBreak/>
-        <w:t>Story</w:t>
+        <w:t>Art and Sound</w:t>
       </w:r>
       <w:r>
         <w:rPr>
@@ -574,12 +813,111 @@
           <w:sz w:val="32"/>
           <w:szCs w:val="32"/>
         </w:rPr>
-        <w:t>Summery</w:t>
-      </w:r>
-      <w:r>
-        <w:rPr>
-          <w:sz w:val="32"/>
-          <w:szCs w:val="32"/>
+        <w:t>Art-Style:</w:t>
+      </w:r>
+    </w:p>
+    <w:p>
+      <w:pPr>
+        <w:pStyle w:val="ListParagraph"/>
+        <w:numPr>
+          <w:ilvl w:val="1"/>
+          <w:numId w:val="1"/>
+        </w:numPr>
+        <w:rPr>
+          <w:sz w:val="32"/>
+          <w:szCs w:val="32"/>
+        </w:rPr>
+      </w:pPr>
+      <w:r>
+        <w:rPr>
+          <w:sz w:val="28"/>
+          <w:szCs w:val="28"/>
+        </w:rPr>
+        <w:t xml:space="preserve">Go for more horrific aesthetics. Sci-Fi is easy, and fantasy grim-dark aesthetics is also a way to go. </w:t>
+      </w:r>
+    </w:p>
+    <w:p>
+      <w:pPr>
+        <w:pStyle w:val="ListParagraph"/>
+        <w:numPr>
+          <w:ilvl w:val="1"/>
+          <w:numId w:val="1"/>
+        </w:numPr>
+        <w:rPr>
+          <w:sz w:val="32"/>
+          <w:szCs w:val="32"/>
+        </w:rPr>
+      </w:pPr>
+      <w:r>
+        <w:rPr>
+          <w:sz w:val="28"/>
+          <w:szCs w:val="28"/>
+        </w:rPr>
+        <w:t>Whatever we can find in free assets</w:t>
+      </w:r>
+    </w:p>
+    <w:p>
+      <w:pPr>
+        <w:pStyle w:val="ListParagraph"/>
+        <w:numPr>
+          <w:ilvl w:val="0"/>
+          <w:numId w:val="1"/>
+        </w:numPr>
+        <w:rPr>
+          <w:sz w:val="32"/>
+          <w:szCs w:val="32"/>
+        </w:rPr>
+      </w:pPr>
+      <w:r>
+        <w:rPr>
+          <w:sz w:val="28"/>
+          <w:szCs w:val="28"/>
+        </w:rPr>
+        <w:t>Lighting:</w:t>
+      </w:r>
+    </w:p>
+    <w:p>
+      <w:pPr>
+        <w:pStyle w:val="ListParagraph"/>
+        <w:numPr>
+          <w:ilvl w:val="1"/>
+          <w:numId w:val="1"/>
+        </w:numPr>
+        <w:rPr>
+          <w:sz w:val="32"/>
+          <w:szCs w:val="32"/>
+        </w:rPr>
+      </w:pPr>
+      <w:r>
+        <w:rPr>
+          <w:sz w:val="28"/>
+          <w:szCs w:val="28"/>
+        </w:rPr>
+        <w:t xml:space="preserve">I think lighting could be an important part of this game. The idea you can be seen or unseen, what you see and what you don’t, play into the horror aspect of it. </w:t>
+      </w:r>
+    </w:p>
+    <w:p>
+      <w:pPr>
+        <w:rPr>
+          <w:rStyle w:val="SubtitleChar"/>
+          <w:sz w:val="40"/>
+          <w:szCs w:val="40"/>
+        </w:rPr>
+      </w:pPr>
+      <w:r>
+        <w:rPr>
+          <w:rStyle w:val="SubtitleChar"/>
+          <w:sz w:val="40"/>
+          <w:szCs w:val="40"/>
+        </w:rPr>
+        <w:lastRenderedPageBreak/>
+        <w:t>UI</w:t>
+      </w:r>
+      <w:r>
+        <w:rPr>
+          <w:rStyle w:val="SubtitleChar"/>
+          <w:sz w:val="40"/>
+          <w:szCs w:val="40"/>
         </w:rPr>
         <w:t>:</w:t>
       </w:r>
@@ -588,6 +926,26 @@
       <w:pPr>
         <w:pStyle w:val="ListParagraph"/>
         <w:numPr>
+          <w:ilvl w:val="0"/>
+          <w:numId w:val="1"/>
+        </w:numPr>
+        <w:rPr>
+          <w:sz w:val="32"/>
+          <w:szCs w:val="32"/>
+        </w:rPr>
+      </w:pPr>
+      <w:r>
+        <w:rPr>
+          <w:sz w:val="32"/>
+          <w:szCs w:val="32"/>
+        </w:rPr>
+        <w:t>Main Menu:</w:t>
+      </w:r>
+    </w:p>
+    <w:p>
+      <w:pPr>
+        <w:pStyle w:val="ListParagraph"/>
+        <w:numPr>
           <w:ilvl w:val="1"/>
           <w:numId w:val="1"/>
         </w:numPr>
@@ -601,8 +959,516 @@
           <w:sz w:val="28"/>
           <w:szCs w:val="28"/>
         </w:rPr>
-        <w:t>Art details</w:t>
-      </w:r>
+        <w:t>Buttons for starting a new game, options, etc.</w:t>
+      </w:r>
+    </w:p>
+    <w:p>
+      <w:pPr>
+        <w:pStyle w:val="ListParagraph"/>
+        <w:numPr>
+          <w:ilvl w:val="0"/>
+          <w:numId w:val="1"/>
+        </w:numPr>
+        <w:rPr>
+          <w:sz w:val="32"/>
+          <w:szCs w:val="32"/>
+        </w:rPr>
+      </w:pPr>
+      <w:r>
+        <w:rPr>
+          <w:sz w:val="28"/>
+          <w:szCs w:val="28"/>
+        </w:rPr>
+        <w:t>No real in-game UI.</w:t>
+      </w:r>
+    </w:p>
+    <w:p>
+      <w:pPr>
+        <w:pStyle w:val="ListParagraph"/>
+        <w:numPr>
+          <w:ilvl w:val="1"/>
+          <w:numId w:val="1"/>
+        </w:numPr>
+        <w:rPr>
+          <w:sz w:val="32"/>
+          <w:szCs w:val="32"/>
+        </w:rPr>
+      </w:pPr>
+      <w:r>
+        <w:rPr>
+          <w:sz w:val="28"/>
+          <w:szCs w:val="28"/>
+        </w:rPr>
+        <w:t>No HUD.</w:t>
+      </w:r>
+    </w:p>
+    <w:p>
+      <w:pPr>
+        <w:pStyle w:val="ListParagraph"/>
+        <w:numPr>
+          <w:ilvl w:val="1"/>
+          <w:numId w:val="1"/>
+        </w:numPr>
+        <w:rPr>
+          <w:sz w:val="32"/>
+          <w:szCs w:val="32"/>
+        </w:rPr>
+      </w:pPr>
+      <w:r>
+        <w:rPr>
+          <w:sz w:val="28"/>
+          <w:szCs w:val="28"/>
+        </w:rPr>
+        <w:t>Contextual input prompts (when interacting or hiding)</w:t>
+      </w:r>
+    </w:p>
+    <w:p>
+      <w:pPr>
+        <w:pStyle w:val="ListParagraph"/>
+        <w:numPr>
+          <w:ilvl w:val="0"/>
+          <w:numId w:val="1"/>
+        </w:numPr>
+        <w:rPr>
+          <w:sz w:val="32"/>
+          <w:szCs w:val="32"/>
+        </w:rPr>
+      </w:pPr>
+      <w:r>
+        <w:rPr>
+          <w:sz w:val="28"/>
+          <w:szCs w:val="28"/>
+        </w:rPr>
+        <w:t xml:space="preserve">Floating Story book text </w:t>
+      </w:r>
+    </w:p>
+    <w:p>
+      <w:pPr>
+        <w:pStyle w:val="ListParagraph"/>
+        <w:numPr>
+          <w:ilvl w:val="1"/>
+          <w:numId w:val="1"/>
+        </w:numPr>
+        <w:rPr>
+          <w:sz w:val="32"/>
+          <w:szCs w:val="32"/>
+        </w:rPr>
+      </w:pPr>
+      <w:r>
+        <w:rPr>
+          <w:noProof/>
+        </w:rPr>
+        <w:drawing>
+          <wp:anchor distT="0" distB="0" distL="114300" distR="114300" simplePos="0" relativeHeight="251659264" behindDoc="0" locked="0" layoutInCell="1" allowOverlap="1" wp14:anchorId="170D7B6B" wp14:editId="7066EB63">
+            <wp:simplePos x="0" y="0"/>
+            <wp:positionH relativeFrom="column">
+              <wp:posOffset>3233843</wp:posOffset>
+            </wp:positionH>
+            <wp:positionV relativeFrom="paragraph">
+              <wp:posOffset>375708</wp:posOffset>
+            </wp:positionV>
+            <wp:extent cx="3089910" cy="1738630"/>
+            <wp:effectExtent l="0" t="0" r="0" b="0"/>
+            <wp:wrapTopAndBottom/>
+            <wp:docPr id="918509599" name="Picture 3" descr="What Remains of Edith Finch Review - Unforgettable"/>
+            <wp:cNvGraphicFramePr>
+              <a:graphicFrameLocks xmlns:a="http://schemas.openxmlformats.org/drawingml/2006/main" noChangeAspect="1"/>
+            </wp:cNvGraphicFramePr>
+            <a:graphic xmlns:a="http://schemas.openxmlformats.org/drawingml/2006/main">
+              <a:graphicData uri="http://schemas.openxmlformats.org/drawingml/2006/picture">
+                <pic:pic xmlns:pic="http://schemas.openxmlformats.org/drawingml/2006/picture">
+                  <pic:nvPicPr>
+                    <pic:cNvPr id="0" name="Picture 5" descr="What Remains of Edith Finch Review - Unforgettable"/>
+                    <pic:cNvPicPr>
+                      <a:picLocks noChangeAspect="1" noChangeArrowheads="1"/>
+                    </pic:cNvPicPr>
+                  </pic:nvPicPr>
+                  <pic:blipFill>
+                    <a:blip r:embed="rId5" cstate="print">
+                      <a:extLst>
+                        <a:ext uri="{28A0092B-C50C-407E-A947-70E740481C1C}">
+                          <a14:useLocalDpi xmlns:a14="http://schemas.microsoft.com/office/drawing/2010/main" val="0"/>
+                        </a:ext>
+                      </a:extLst>
+                    </a:blip>
+                    <a:srcRect/>
+                    <a:stretch>
+                      <a:fillRect/>
+                    </a:stretch>
+                  </pic:blipFill>
+                  <pic:spPr bwMode="auto">
+                    <a:xfrm>
+                      <a:off x="0" y="0"/>
+                      <a:ext cx="3089910" cy="1738630"/>
+                    </a:xfrm>
+                    <a:prstGeom prst="rect">
+                      <a:avLst/>
+                    </a:prstGeom>
+                    <a:noFill/>
+                    <a:ln>
+                      <a:noFill/>
+                    </a:ln>
+                  </pic:spPr>
+                </pic:pic>
+              </a:graphicData>
+            </a:graphic>
+            <wp14:sizeRelH relativeFrom="margin">
+              <wp14:pctWidth>0</wp14:pctWidth>
+            </wp14:sizeRelH>
+            <wp14:sizeRelV relativeFrom="margin">
+              <wp14:pctHeight>0</wp14:pctHeight>
+            </wp14:sizeRelV>
+          </wp:anchor>
+        </w:drawing>
+      </w:r>
+      <w:r>
+        <w:rPr>
+          <w:noProof/>
+        </w:rPr>
+        <w:drawing>
+          <wp:anchor distT="0" distB="0" distL="114300" distR="114300" simplePos="0" relativeHeight="251658240" behindDoc="0" locked="0" layoutInCell="1" allowOverlap="1" wp14:anchorId="5DD116E0" wp14:editId="299C68A3">
+            <wp:simplePos x="0" y="0"/>
+            <wp:positionH relativeFrom="margin">
+              <wp:align>left</wp:align>
+            </wp:positionH>
+            <wp:positionV relativeFrom="paragraph">
+              <wp:posOffset>341630</wp:posOffset>
+            </wp:positionV>
+            <wp:extent cx="3098800" cy="1743075"/>
+            <wp:effectExtent l="0" t="0" r="6350" b="9525"/>
+            <wp:wrapTopAndBottom/>
+            <wp:docPr id="948261784" name="Picture 1" descr="What Remains of Edith Finch Review - Unforgettable"/>
+            <wp:cNvGraphicFramePr>
+              <a:graphicFrameLocks xmlns:a="http://schemas.openxmlformats.org/drawingml/2006/main" noChangeAspect="1"/>
+            </wp:cNvGraphicFramePr>
+            <a:graphic xmlns:a="http://schemas.openxmlformats.org/drawingml/2006/main">
+              <a:graphicData uri="http://schemas.openxmlformats.org/drawingml/2006/picture">
+                <pic:pic xmlns:pic="http://schemas.openxmlformats.org/drawingml/2006/picture">
+                  <pic:nvPicPr>
+                    <pic:cNvPr id="0" name="Picture 1" descr="What Remains of Edith Finch Review - Unforgettable"/>
+                    <pic:cNvPicPr>
+                      <a:picLocks noChangeAspect="1" noChangeArrowheads="1"/>
+                    </pic:cNvPicPr>
+                  </pic:nvPicPr>
+                  <pic:blipFill>
+                    <a:blip r:embed="rId6" cstate="print">
+                      <a:extLst>
+                        <a:ext uri="{28A0092B-C50C-407E-A947-70E740481C1C}">
+                          <a14:useLocalDpi xmlns:a14="http://schemas.microsoft.com/office/drawing/2010/main" val="0"/>
+                        </a:ext>
+                      </a:extLst>
+                    </a:blip>
+                    <a:srcRect/>
+                    <a:stretch>
+                      <a:fillRect/>
+                    </a:stretch>
+                  </pic:blipFill>
+                  <pic:spPr bwMode="auto">
+                    <a:xfrm>
+                      <a:off x="0" y="0"/>
+                      <a:ext cx="3102093" cy="1744927"/>
+                    </a:xfrm>
+                    <a:prstGeom prst="rect">
+                      <a:avLst/>
+                    </a:prstGeom>
+                    <a:noFill/>
+                    <a:ln>
+                      <a:noFill/>
+                    </a:ln>
+                  </pic:spPr>
+                </pic:pic>
+              </a:graphicData>
+            </a:graphic>
+            <wp14:sizeRelH relativeFrom="margin">
+              <wp14:pctWidth>0</wp14:pctWidth>
+            </wp14:sizeRelH>
+            <wp14:sizeRelV relativeFrom="margin">
+              <wp14:pctHeight>0</wp14:pctHeight>
+            </wp14:sizeRelV>
+          </wp:anchor>
+        </w:drawing>
+      </w:r>
+      <w:r>
+        <w:rPr>
+          <w:sz w:val="32"/>
+          <w:szCs w:val="32"/>
+        </w:rPr>
+        <w:t xml:space="preserve">Like </w:t>
+      </w:r>
+      <w:r>
+        <w:rPr>
+          <w:i/>
+          <w:iCs/>
+          <w:sz w:val="32"/>
+          <w:szCs w:val="32"/>
+        </w:rPr>
+        <w:t>What Remains of Edith Finch</w:t>
+      </w:r>
+    </w:p>
+    <w:p>
+      <w:pPr>
+        <w:rPr>
+          <w:rStyle w:val="SubtitleChar"/>
+          <w:sz w:val="40"/>
+          <w:szCs w:val="40"/>
+        </w:rPr>
+      </w:pPr>
+    </w:p>
+    <w:p>
+      <w:pPr>
+        <w:rPr>
+          <w:rStyle w:val="SubtitleChar"/>
+          <w:sz w:val="40"/>
+          <w:szCs w:val="40"/>
+        </w:rPr>
+      </w:pPr>
+    </w:p>
+    <w:p>
+      <w:pPr>
+        <w:rPr>
+          <w:rStyle w:val="SubtitleChar"/>
+          <w:sz w:val="40"/>
+          <w:szCs w:val="40"/>
+        </w:rPr>
+      </w:pPr>
+      <w:r>
+        <w:rPr>
+          <w:rStyle w:val="SubtitleChar"/>
+          <w:sz w:val="40"/>
+          <w:szCs w:val="40"/>
+        </w:rPr>
+        <w:t>Story</w:t>
+      </w:r>
+      <w:r>
+        <w:rPr>
+          <w:rStyle w:val="SubtitleChar"/>
+          <w:sz w:val="40"/>
+          <w:szCs w:val="40"/>
+        </w:rPr>
+        <w:t>:</w:t>
+      </w:r>
+    </w:p>
+    <w:p>
+      <w:pPr>
+        <w:pStyle w:val="ListParagraph"/>
+        <w:numPr>
+          <w:ilvl w:val="0"/>
+          <w:numId w:val="1"/>
+        </w:numPr>
+        <w:rPr>
+          <w:sz w:val="32"/>
+          <w:szCs w:val="32"/>
+        </w:rPr>
+      </w:pPr>
+      <w:r>
+        <w:rPr>
+          <w:sz w:val="32"/>
+          <w:szCs w:val="32"/>
+        </w:rPr>
+        <w:t xml:space="preserve">[character] wakes up in a [location: genre specific]. The area is dark, it’s quiet, and there’s no real indication there’s anyone around. Childhood-like story plays as floating text (similar to </w:t>
+      </w:r>
+      <w:r>
+        <w:rPr>
+          <w:i/>
+          <w:iCs/>
+          <w:sz w:val="32"/>
+          <w:szCs w:val="32"/>
+        </w:rPr>
+        <w:t>What Remains of Edith Finch</w:t>
+      </w:r>
+      <w:r>
+        <w:rPr>
+          <w:sz w:val="32"/>
+          <w:szCs w:val="32"/>
+        </w:rPr>
+        <w:t xml:space="preserve">) about a story of a girl and a snake, about growth and change etc. </w:t>
+      </w:r>
+    </w:p>
+    <w:p>
+      <w:pPr>
+        <w:pStyle w:val="ListParagraph"/>
+        <w:numPr>
+          <w:ilvl w:val="1"/>
+          <w:numId w:val="1"/>
+        </w:numPr>
+        <w:rPr>
+          <w:sz w:val="32"/>
+          <w:szCs w:val="32"/>
+        </w:rPr>
+      </w:pPr>
+      <w:r>
+        <w:rPr>
+          <w:sz w:val="32"/>
+          <w:szCs w:val="32"/>
+        </w:rPr>
+        <w:t xml:space="preserve">As the story goes on, darker and darker twists arise in the form of: darker themes and writing, (harder encounters () means optional), </w:t>
+      </w:r>
+      <w:r>
+        <w:rPr>
+          <w:i/>
+          <w:iCs/>
+          <w:sz w:val="32"/>
+          <w:szCs w:val="32"/>
+        </w:rPr>
+        <w:t>something</w:t>
+      </w:r>
+      <w:r>
+        <w:rPr>
+          <w:sz w:val="32"/>
+          <w:szCs w:val="32"/>
+        </w:rPr>
+        <w:t xml:space="preserve"> always popping up in the pages, that lurks beyond the view of the game’s camera. </w:t>
+      </w:r>
+    </w:p>
+    <w:p>
+      <w:pPr>
+        <w:pStyle w:val="ListParagraph"/>
+        <w:numPr>
+          <w:ilvl w:val="1"/>
+          <w:numId w:val="1"/>
+        </w:numPr>
+        <w:rPr>
+          <w:sz w:val="32"/>
+          <w:szCs w:val="32"/>
+        </w:rPr>
+      </w:pPr>
+      <w:r>
+        <w:rPr>
+          <w:sz w:val="32"/>
+          <w:szCs w:val="32"/>
+        </w:rPr>
+        <w:lastRenderedPageBreak/>
+        <w:t xml:space="preserve">At the end, the story goes backwards, having the player try and move backwards through the story, only the inversed reading feels weird and grotesque, giving the player senses of unease. </w:t>
+      </w:r>
+    </w:p>
+    <w:p>
+      <w:pPr>
+        <w:pStyle w:val="ListParagraph"/>
+        <w:numPr>
+          <w:ilvl w:val="2"/>
+          <w:numId w:val="1"/>
+        </w:numPr>
+        <w:rPr>
+          <w:sz w:val="32"/>
+          <w:szCs w:val="32"/>
+        </w:rPr>
+      </w:pPr>
+      <w:r>
+        <w:rPr>
+          <w:sz w:val="32"/>
+          <w:szCs w:val="32"/>
+        </w:rPr>
+        <w:t>At this point, there’s an opportunity to allow the player to move into and out of the book, (which looks more like the world itself is changing)</w:t>
+      </w:r>
+    </w:p>
+    <w:p>
+      <w:pPr>
+        <w:pStyle w:val="ListParagraph"/>
+        <w:numPr>
+          <w:ilvl w:val="1"/>
+          <w:numId w:val="1"/>
+        </w:numPr>
+        <w:rPr>
+          <w:sz w:val="32"/>
+          <w:szCs w:val="32"/>
+        </w:rPr>
+      </w:pPr>
+      <w:r>
+        <w:rPr>
+          <w:sz w:val="32"/>
+          <w:szCs w:val="32"/>
+        </w:rPr>
+        <w:t>With each encounter, the [character] starts to grow into something else, something dark, shadowy. They notice there are other figures in the place they are, which look like them, like physical shadows that have weight and mass.</w:t>
+      </w:r>
+    </w:p>
+    <w:p>
+      <w:pPr>
+        <w:pStyle w:val="ListParagraph"/>
+        <w:numPr>
+          <w:ilvl w:val="1"/>
+          <w:numId w:val="1"/>
+        </w:numPr>
+        <w:rPr>
+          <w:sz w:val="32"/>
+          <w:szCs w:val="32"/>
+        </w:rPr>
+      </w:pPr>
+      <w:r>
+        <w:rPr>
+          <w:sz w:val="32"/>
+          <w:szCs w:val="32"/>
+        </w:rPr>
+        <w:t xml:space="preserve">At the end of the story, the [character] winds up back at the place they woke up in, and through a series of interactions, become the reason why the [character] wakes up in the first place. </w:t>
+      </w:r>
+    </w:p>
+    <w:p>
+      <w:pPr>
+        <w:pStyle w:val="ListParagraph"/>
+        <w:numPr>
+          <w:ilvl w:val="0"/>
+          <w:numId w:val="1"/>
+        </w:numPr>
+        <w:rPr>
+          <w:sz w:val="32"/>
+          <w:szCs w:val="32"/>
+        </w:rPr>
+      </w:pPr>
+      <w:r>
+        <w:rPr>
+          <w:sz w:val="32"/>
+          <w:szCs w:val="32"/>
+        </w:rPr>
+        <w:t>Summ</w:t>
+      </w:r>
+      <w:r>
+        <w:rPr>
+          <w:sz w:val="32"/>
+          <w:szCs w:val="32"/>
+        </w:rPr>
+        <w:t>a</w:t>
+      </w:r>
+      <w:r>
+        <w:rPr>
+          <w:sz w:val="32"/>
+          <w:szCs w:val="32"/>
+        </w:rPr>
+        <w:t>ry:</w:t>
+      </w:r>
+    </w:p>
+    <w:p>
+      <w:pPr>
+        <w:pStyle w:val="ListParagraph"/>
+        <w:numPr>
+          <w:ilvl w:val="1"/>
+          <w:numId w:val="1"/>
+        </w:numPr>
+        <w:rPr>
+          <w:sz w:val="32"/>
+          <w:szCs w:val="32"/>
+        </w:rPr>
+      </w:pPr>
+      <w:r>
+        <w:rPr>
+          <w:sz w:val="32"/>
+          <w:szCs w:val="32"/>
+        </w:rPr>
+        <w:t>The story of this game jam game is about how our choices change us</w:t>
+      </w:r>
+      <w:r>
+        <w:rPr>
+          <w:sz w:val="32"/>
+          <w:szCs w:val="32"/>
+        </w:rPr>
+        <w:t>, and each choice leaves its scars upon you, and how if you aren’t careful, you’re going to inflict the same fate upon someone you care about (in this case, the player themselves)</w:t>
+      </w:r>
+    </w:p>
+    <w:p>
+      <w:pPr>
+        <w:rPr>
+          <w:sz w:val="32"/>
+          <w:szCs w:val="32"/>
+        </w:rPr>
+      </w:pPr>
     </w:p>
     <w:sectPr>
       <w:pgSz w:w="12240" w:h="15840"/>
@@ -757,7 +1623,7 @@
         <w:rFonts w:ascii="Courier New" w:hAnsi="Courier New" w:cs="Courier New" w:hint="default"/>
       </w:rPr>
     </w:lvl>
-    <w:lvl w:ilvl="2" w:tplc="10090005" w:tentative="1">
+    <w:lvl w:ilvl="2" w:tplc="10090005">
       <w:start w:val="1"/>
       <w:numFmt w:val="bullet"/>
       <w:lvlText w:val=""/>

</xml_diff>